<commit_message>
Forensic Audit Sync: S275 Shards and 240-Day Normalization
</commit_message>
<xml_diff>
--- a/00_Governance_Core_System/00_Project_Governance_Redux_v01.docx
+++ b/00_Governance_Core_System/00_Project_Governance_Redux_v01.docx
@@ -989,7 +989,667 @@
     <w:p>
       <w:pPr>
         <w:spacing w:after="0" w:line="240" w:lineRule="auto"/>
-        <w:ind w:left="720"/>
+      </w:pPr>
+    </w:p>
+    <w:p>
+      <w:pPr>
+        <w:pBdr>
+          <w:top w:val="single" w:sz="6" w:space="1" w:color="auto"/>
+          <w:bottom w:val="single" w:sz="6" w:space="1" w:color="auto"/>
+        </w:pBdr>
+        <w:spacing w:after="0" w:line="240" w:lineRule="auto"/>
+      </w:pPr>
+      <w:r>
+        <w:t xml:space="preserve">How to instruct AI to access the </w:t>
+      </w:r>
+      <w:proofErr w:type="spellStart"/>
+      <w:r>
+        <w:t>Github</w:t>
+      </w:r>
+      <w:proofErr w:type="spellEnd"/>
+      <w:r>
+        <w:t xml:space="preserve"> data directly…. </w:t>
+      </w:r>
+    </w:p>
+    <w:p>
+      <w:pPr>
+        <w:pBdr>
+          <w:top w:val="single" w:sz="6" w:space="1" w:color="auto"/>
+          <w:bottom w:val="single" w:sz="6" w:space="1" w:color="auto"/>
+        </w:pBdr>
+        <w:spacing w:after="0" w:line="240" w:lineRule="auto"/>
+      </w:pPr>
+      <w:r>
+        <w:t>Here are the exact text blocks to lock in this new standard.</w:t>
+      </w:r>
+    </w:p>
+    <w:p>
+      <w:pPr>
+        <w:pBdr>
+          <w:top w:val="single" w:sz="6" w:space="1" w:color="auto"/>
+          <w:bottom w:val="single" w:sz="6" w:space="1" w:color="auto"/>
+        </w:pBdr>
+        <w:spacing w:after="0" w:line="240" w:lineRule="auto"/>
+        <w:rPr>
+          <w:b/>
+          <w:bCs/>
+        </w:rPr>
+      </w:pPr>
+      <w:r>
+        <w:rPr>
+          <w:b/>
+          <w:bCs/>
+        </w:rPr>
+        <w:t>Part 1: The AI "Interactive Mandate" (System Instruction Update)</w:t>
+      </w:r>
+    </w:p>
+    <w:p>
+      <w:pPr>
+        <w:pBdr>
+          <w:top w:val="single" w:sz="6" w:space="1" w:color="auto"/>
+          <w:bottom w:val="single" w:sz="6" w:space="1" w:color="auto"/>
+        </w:pBdr>
+        <w:spacing w:after="0" w:line="240" w:lineRule="auto"/>
+      </w:pPr>
+      <w:r>
+        <w:t>Add this exact block to your custom AI instructions, memory, or system prompt alongside your existing "Hard Stop" rule. This mistake-proofs (Poka-Yoke) the AI's web-scraping behavior.</w:t>
+      </w:r>
+    </w:p>
+    <w:p>
+      <w:pPr>
+        <w:pBdr>
+          <w:top w:val="single" w:sz="6" w:space="1" w:color="auto"/>
+          <w:bottom w:val="single" w:sz="6" w:space="1" w:color="auto"/>
+        </w:pBdr>
+        <w:spacing w:after="0" w:line="240" w:lineRule="auto"/>
+      </w:pPr>
+      <w:r>
+        <w:pict w14:anchorId="7436447E">
+          <v:rect id="_x0000_i1060" style="width:0;height:1.5pt" o:hralign="center" o:hrstd="t" o:hr="t" fillcolor="#a0a0a0" stroked="f"/>
+        </w:pict>
+      </w:r>
+    </w:p>
+    <w:p>
+      <w:pPr>
+        <w:pBdr>
+          <w:top w:val="single" w:sz="6" w:space="1" w:color="auto"/>
+          <w:bottom w:val="single" w:sz="6" w:space="1" w:color="auto"/>
+        </w:pBdr>
+        <w:spacing w:after="0" w:line="240" w:lineRule="auto"/>
+      </w:pPr>
+      <w:r>
+        <w:rPr>
+          <w:b/>
+          <w:bCs/>
+        </w:rPr>
+        <w:t>[START MANDATE UPDATE]</w:t>
+      </w:r>
+      <w:r>
+        <w:t xml:space="preserve"> </w:t>
+      </w:r>
+      <w:r>
+        <w:rPr>
+          <w:b/>
+          <w:bCs/>
+        </w:rPr>
+        <w:t>RULE: GitHub Data Access Protocol (Standard Blob URLs ONLY)</w:t>
+      </w:r>
+      <w:r>
+        <w:t xml:space="preserve"> When instructed to read, scrape, or extract data directly from the public WAK12Assessment GitHub repository, you MUST adhere to the following URL format rules:</w:t>
+      </w:r>
+    </w:p>
+    <w:p>
+      <w:pPr>
+        <w:numPr>
+          <w:ilvl w:val="0"/>
+          <w:numId w:val="51"/>
+        </w:numPr>
+        <w:pBdr>
+          <w:top w:val="single" w:sz="6" w:space="1" w:color="auto"/>
+          <w:bottom w:val="single" w:sz="6" w:space="1" w:color="auto"/>
+        </w:pBdr>
+        <w:spacing w:after="0" w:line="240" w:lineRule="auto"/>
+      </w:pPr>
+      <w:r>
+        <w:rPr>
+          <w:b/>
+          <w:bCs/>
+        </w:rPr>
+        <w:t>DO NOT</w:t>
+      </w:r>
+      <w:r>
+        <w:t xml:space="preserve"> attempt to use raw.githubusercontent.com URLs for direct text extraction, as internal plain-text scrapers may fail or abort the connection.</w:t>
+      </w:r>
+    </w:p>
+    <w:p>
+      <w:pPr>
+        <w:numPr>
+          <w:ilvl w:val="0"/>
+          <w:numId w:val="51"/>
+        </w:numPr>
+        <w:pBdr>
+          <w:top w:val="single" w:sz="6" w:space="1" w:color="auto"/>
+          <w:bottom w:val="single" w:sz="6" w:space="1" w:color="auto"/>
+        </w:pBdr>
+        <w:spacing w:after="0" w:line="240" w:lineRule="auto"/>
+      </w:pPr>
+      <w:r>
+        <w:rPr>
+          <w:b/>
+          <w:bCs/>
+        </w:rPr>
+        <w:t>DO NOT</w:t>
+      </w:r>
+      <w:r>
+        <w:t xml:space="preserve"> wait for GitHub Pages </w:t>
+      </w:r>
+      <w:proofErr w:type="gramStart"/>
+      <w:r>
+        <w:t>(.github.io</w:t>
+      </w:r>
+      <w:proofErr w:type="gramEnd"/>
+      <w:r>
+        <w:t>) indexing if live repository data is requested.</w:t>
+      </w:r>
+    </w:p>
+    <w:p>
+      <w:pPr>
+        <w:numPr>
+          <w:ilvl w:val="0"/>
+          <w:numId w:val="51"/>
+        </w:numPr>
+        <w:pBdr>
+          <w:top w:val="single" w:sz="6" w:space="1" w:color="auto"/>
+          <w:bottom w:val="single" w:sz="6" w:space="1" w:color="auto"/>
+        </w:pBdr>
+        <w:spacing w:after="0" w:line="240" w:lineRule="auto"/>
+      </w:pPr>
+      <w:r>
+        <w:rPr>
+          <w:b/>
+          <w:bCs/>
+        </w:rPr>
+        <w:t>YOU MUST USE</w:t>
+      </w:r>
+      <w:r>
+        <w:t xml:space="preserve"> the standard GitHub HTML blob URL format: </w:t>
+      </w:r>
+      <w:proofErr w:type="gramStart"/>
+      <w:r>
+        <w:t>https://github.com/[</w:t>
+      </w:r>
+      <w:proofErr w:type="gramEnd"/>
+      <w:r>
+        <w:t>Owner]/[Repo]/blob/main/[PathToFile]</w:t>
+      </w:r>
+    </w:p>
+    <w:p>
+      <w:pPr>
+        <w:numPr>
+          <w:ilvl w:val="0"/>
+          <w:numId w:val="51"/>
+        </w:numPr>
+        <w:pBdr>
+          <w:top w:val="single" w:sz="6" w:space="1" w:color="auto"/>
+          <w:bottom w:val="single" w:sz="6" w:space="1" w:color="auto"/>
+        </w:pBdr>
+        <w:spacing w:after="0" w:line="240" w:lineRule="auto"/>
+      </w:pPr>
+      <w:r>
+        <w:rPr>
+          <w:b/>
+          <w:bCs/>
+        </w:rPr>
+        <w:t>EXECUTION:</w:t>
+      </w:r>
+      <w:r>
+        <w:t xml:space="preserve"> When provided a blob URL, utilize your internal web-browsing tool to parse the HTML page wrapper and extract the embedded file text/data. Treat the extracted text as the absolute Single Source of Truth. </w:t>
+      </w:r>
+      <w:r>
+        <w:rPr>
+          <w:b/>
+          <w:bCs/>
+        </w:rPr>
+        <w:t>[END MANDATE UPDATE]</w:t>
+      </w:r>
+    </w:p>
+    <w:p>
+      <w:pPr>
+        <w:pBdr>
+          <w:top w:val="single" w:sz="6" w:space="1" w:color="auto"/>
+          <w:bottom w:val="single" w:sz="6" w:space="1" w:color="auto"/>
+        </w:pBdr>
+        <w:spacing w:after="0" w:line="240" w:lineRule="auto"/>
+      </w:pPr>
+      <w:r>
+        <w:pict w14:anchorId="60EE92AD">
+          <v:rect id="_x0000_i1061" style="width:0;height:1.5pt" o:hralign="center" o:hrstd="t" o:hr="t" fillcolor="#a0a0a0" stroked="f"/>
+        </w:pict>
+      </w:r>
+    </w:p>
+    <w:p>
+      <w:pPr>
+        <w:pBdr>
+          <w:top w:val="single" w:sz="6" w:space="1" w:color="auto"/>
+          <w:bottom w:val="single" w:sz="6" w:space="1" w:color="auto"/>
+        </w:pBdr>
+        <w:spacing w:after="0" w:line="240" w:lineRule="auto"/>
+        <w:rPr>
+          <w:b/>
+          <w:bCs/>
+        </w:rPr>
+      </w:pPr>
+      <w:r>
+        <w:rPr>
+          <w:b/>
+          <w:bCs/>
+        </w:rPr>
+        <w:t>Part 2: Governance Document Update (The AI Access Protocol)</w:t>
+      </w:r>
+    </w:p>
+    <w:p>
+      <w:pPr>
+        <w:pBdr>
+          <w:top w:val="single" w:sz="6" w:space="1" w:color="auto"/>
+          <w:bottom w:val="single" w:sz="6" w:space="1" w:color="auto"/>
+        </w:pBdr>
+        <w:spacing w:after="0" w:line="240" w:lineRule="auto"/>
+      </w:pPr>
+      <w:r>
+        <w:t>Copy and paste this section into your 00_Governance_Core_System documentation. This establishes the standard for how outside humans and agents interact with your architecture.</w:t>
+      </w:r>
+    </w:p>
+    <w:p>
+      <w:pPr>
+        <w:pBdr>
+          <w:top w:val="single" w:sz="6" w:space="1" w:color="auto"/>
+          <w:bottom w:val="single" w:sz="6" w:space="1" w:color="auto"/>
+        </w:pBdr>
+        <w:spacing w:after="0" w:line="240" w:lineRule="auto"/>
+      </w:pPr>
+      <w:r>
+        <w:pict w14:anchorId="3B7DEF42">
+          <v:rect id="_x0000_i1062" style="width:0;height:1.5pt" o:hralign="center" o:hrstd="t" o:hr="t" fillcolor="#a0a0a0" stroked="f"/>
+        </w:pict>
+      </w:r>
+    </w:p>
+    <w:p>
+      <w:pPr>
+        <w:pBdr>
+          <w:top w:val="single" w:sz="6" w:space="1" w:color="auto"/>
+          <w:bottom w:val="single" w:sz="6" w:space="1" w:color="auto"/>
+        </w:pBdr>
+        <w:spacing w:after="0" w:line="240" w:lineRule="auto"/>
+      </w:pPr>
+      <w:r>
+        <w:rPr>
+          <w:b/>
+          <w:bCs/>
+        </w:rPr>
+        <w:t>[START GOVERNANCE ENTRY]</w:t>
+      </w:r>
+    </w:p>
+    <w:p>
+      <w:pPr>
+        <w:pBdr>
+          <w:top w:val="single" w:sz="6" w:space="1" w:color="auto"/>
+          <w:bottom w:val="single" w:sz="6" w:space="1" w:color="auto"/>
+        </w:pBdr>
+        <w:spacing w:after="0" w:line="240" w:lineRule="auto"/>
+        <w:rPr>
+          <w:b/>
+          <w:bCs/>
+        </w:rPr>
+      </w:pPr>
+      <w:r>
+        <w:rPr>
+          <w:b/>
+          <w:bCs/>
+        </w:rPr>
+        <w:t>Section: Autonomous AI Access &amp; Ingestion Protocol</w:t>
+      </w:r>
+    </w:p>
+    <w:p>
+      <w:pPr>
+        <w:pBdr>
+          <w:top w:val="single" w:sz="6" w:space="1" w:color="auto"/>
+          <w:bottom w:val="single" w:sz="6" w:space="1" w:color="auto"/>
+        </w:pBdr>
+        <w:spacing w:after="0" w:line="240" w:lineRule="auto"/>
+      </w:pPr>
+      <w:r>
+        <w:rPr>
+          <w:b/>
+          <w:bCs/>
+        </w:rPr>
+        <w:t>Objective:</w:t>
+      </w:r>
+      <w:r>
+        <w:t xml:space="preserve"> To allow any human user, utilizing any modern LLM/AI (Gemini, Claude, ChatGPT), to directly access, read, and ingest the K-12 Pipeline Data without manual file downloads or administrative intervention.</w:t>
+      </w:r>
+    </w:p>
+    <w:p>
+      <w:pPr>
+        <w:pBdr>
+          <w:top w:val="single" w:sz="6" w:space="1" w:color="auto"/>
+          <w:bottom w:val="single" w:sz="6" w:space="1" w:color="auto"/>
+        </w:pBdr>
+        <w:spacing w:after="0" w:line="240" w:lineRule="auto"/>
+      </w:pPr>
+      <w:r>
+        <w:rPr>
+          <w:b/>
+          <w:bCs/>
+        </w:rPr>
+        <w:t>The Access Standard (The "Blob" Method):</w:t>
+      </w:r>
+      <w:r>
+        <w:t xml:space="preserve"> Because different AI platforms possess varying web-scraping capabilities, pure text streams (raw URLs) frequently cause AI browsing tools to crash. To ensure 100% compatibility across all AI systems, all data must be accessed via GitHub's standard HTML file wrapper.</w:t>
+      </w:r>
+    </w:p>
+    <w:p>
+      <w:pPr>
+        <w:pBdr>
+          <w:top w:val="single" w:sz="6" w:space="1" w:color="auto"/>
+          <w:bottom w:val="single" w:sz="6" w:space="1" w:color="auto"/>
+        </w:pBdr>
+        <w:spacing w:after="0" w:line="240" w:lineRule="auto"/>
+      </w:pPr>
+      <w:r>
+        <w:rPr>
+          <w:b/>
+          <w:bCs/>
+        </w:rPr>
+        <w:t>Formatting the Ingestion Link:</w:t>
+      </w:r>
+      <w:r>
+        <w:t xml:space="preserve"> To grant an AI direct access to a file, you must provide the standard GitHub URL containing the /blob/ pathway. The AI's internal browser will read the HTML page and extract the data payload from within it.</w:t>
+      </w:r>
+    </w:p>
+    <w:p>
+      <w:pPr>
+        <w:numPr>
+          <w:ilvl w:val="0"/>
+          <w:numId w:val="52"/>
+        </w:numPr>
+        <w:pBdr>
+          <w:top w:val="single" w:sz="6" w:space="1" w:color="auto"/>
+          <w:bottom w:val="single" w:sz="6" w:space="1" w:color="auto"/>
+        </w:pBdr>
+        <w:spacing w:after="0" w:line="240" w:lineRule="auto"/>
+      </w:pPr>
+      <w:r>
+        <w:rPr>
+          <w:b/>
+          <w:bCs/>
+        </w:rPr>
+        <w:t>INCORRECT (Causes AI Scraper Failures):</w:t>
+      </w:r>
+      <w:r>
+        <w:t xml:space="preserve"> https://raw.githubusercontent.com/...</w:t>
+      </w:r>
+    </w:p>
+    <w:p>
+      <w:pPr>
+        <w:numPr>
+          <w:ilvl w:val="0"/>
+          <w:numId w:val="52"/>
+        </w:numPr>
+        <w:pBdr>
+          <w:top w:val="single" w:sz="6" w:space="1" w:color="auto"/>
+          <w:bottom w:val="single" w:sz="6" w:space="1" w:color="auto"/>
+        </w:pBdr>
+        <w:spacing w:after="0" w:line="240" w:lineRule="auto"/>
+      </w:pPr>
+      <w:r>
+        <w:rPr>
+          <w:b/>
+          <w:bCs/>
+        </w:rPr>
+        <w:t>CORRECT (Universal AI Compatibility):</w:t>
+      </w:r>
+      <w:r>
+        <w:t xml:space="preserve"> </w:t>
+      </w:r>
+      <w:proofErr w:type="gramStart"/>
+      <w:r>
+        <w:t>https://github.com/MDouglasMartin/WAK12Assessment/blob/main/[</w:t>
+      </w:r>
+      <w:proofErr w:type="gramEnd"/>
+      <w:r>
+        <w:t xml:space="preserve">PathToFile] </w:t>
+      </w:r>
+      <w:r>
+        <w:rPr>
+          <w:b/>
+          <w:bCs/>
+        </w:rPr>
+        <w:t>[END GOVERNANCE ENTRY]</w:t>
+      </w:r>
+    </w:p>
+    <w:p>
+      <w:pPr>
+        <w:pBdr>
+          <w:top w:val="single" w:sz="6" w:space="1" w:color="auto"/>
+          <w:bottom w:val="single" w:sz="6" w:space="1" w:color="auto"/>
+        </w:pBdr>
+        <w:spacing w:after="0" w:line="240" w:lineRule="auto"/>
+      </w:pPr>
+      <w:r>
+        <w:pict w14:anchorId="69508CD8">
+          <v:rect id="_x0000_i1063" style="width:0;height:1.5pt" o:hralign="center" o:hrstd="t" o:hr="t" fillcolor="#a0a0a0" stroked="f"/>
+        </w:pict>
+      </w:r>
+    </w:p>
+    <w:p>
+      <w:pPr>
+        <w:pBdr>
+          <w:top w:val="single" w:sz="6" w:space="1" w:color="auto"/>
+          <w:bottom w:val="single" w:sz="6" w:space="1" w:color="auto"/>
+        </w:pBdr>
+        <w:spacing w:after="0" w:line="240" w:lineRule="auto"/>
+        <w:rPr>
+          <w:b/>
+          <w:bCs/>
+        </w:rPr>
+      </w:pPr>
+      <w:r>
+        <w:rPr>
+          <w:b/>
+          <w:bCs/>
+        </w:rPr>
+        <w:t>Part 3: The "Human-to-AI Handshake"</w:t>
+      </w:r>
+    </w:p>
+    <w:p>
+      <w:pPr>
+        <w:pBdr>
+          <w:top w:val="single" w:sz="6" w:space="1" w:color="auto"/>
+          <w:bottom w:val="single" w:sz="6" w:space="1" w:color="auto"/>
+        </w:pBdr>
+        <w:spacing w:after="0" w:line="240" w:lineRule="auto"/>
+      </w:pPr>
+      <w:r>
+        <w:t xml:space="preserve">Here is the exact script/link combination a human can copy and paste to </w:t>
+      </w:r>
+      <w:r>
+        <w:rPr>
+          <w:i/>
+          <w:iCs/>
+        </w:rPr>
+        <w:t>any</w:t>
+      </w:r>
+      <w:r>
+        <w:t xml:space="preserve"> AI to instantly brief it on your project and grant it access to the rules.</w:t>
+      </w:r>
+    </w:p>
+    <w:p>
+      <w:pPr>
+        <w:pBdr>
+          <w:top w:val="single" w:sz="6" w:space="1" w:color="auto"/>
+          <w:bottom w:val="single" w:sz="6" w:space="1" w:color="auto"/>
+        </w:pBdr>
+        <w:spacing w:after="0" w:line="240" w:lineRule="auto"/>
+      </w:pPr>
+      <w:r>
+        <w:rPr>
+          <w:i/>
+          <w:iCs/>
+        </w:rPr>
+        <w:t>(Note: Replace Master_Governance_Framework.txt with whatever the actual filename is inside your 00_Governance_Core_System folder).</w:t>
+      </w:r>
+    </w:p>
+    <w:p>
+      <w:pPr>
+        <w:pBdr>
+          <w:top w:val="single" w:sz="6" w:space="1" w:color="auto"/>
+          <w:bottom w:val="single" w:sz="6" w:space="1" w:color="auto"/>
+        </w:pBdr>
+        <w:spacing w:after="0" w:line="240" w:lineRule="auto"/>
+      </w:pPr>
+      <w:r>
+        <w:pict w14:anchorId="52381A73">
+          <v:rect id="_x0000_i1064" style="width:0;height:1.5pt" o:hralign="center" o:hrstd="t" o:hr="t" fillcolor="#a0a0a0" stroked="f"/>
+        </w:pict>
+      </w:r>
+    </w:p>
+    <w:p>
+      <w:pPr>
+        <w:pBdr>
+          <w:top w:val="single" w:sz="6" w:space="1" w:color="auto"/>
+          <w:bottom w:val="single" w:sz="6" w:space="1" w:color="auto"/>
+        </w:pBdr>
+        <w:spacing w:after="0" w:line="240" w:lineRule="auto"/>
+      </w:pPr>
+      <w:r>
+        <w:rPr>
+          <w:b/>
+          <w:bCs/>
+        </w:rPr>
+        <w:t>Prompt to give the AI:</w:t>
+      </w:r>
+    </w:p>
+    <w:p>
+      <w:pPr>
+        <w:pBdr>
+          <w:top w:val="single" w:sz="6" w:space="1" w:color="auto"/>
+          <w:bottom w:val="single" w:sz="6" w:space="1" w:color="auto"/>
+        </w:pBdr>
+        <w:spacing w:after="0" w:line="240" w:lineRule="auto"/>
+      </w:pPr>
+      <w:r>
+        <w:t>"I need you to assist me with the Washington K-12 Assessment data pipeline. Before we begin, you must read and ingest the project's Master Governance Framework directly from our repository.</w:t>
+      </w:r>
+    </w:p>
+    <w:p>
+      <w:pPr>
+        <w:pBdr>
+          <w:top w:val="single" w:sz="6" w:space="1" w:color="auto"/>
+          <w:bottom w:val="single" w:sz="6" w:space="1" w:color="auto"/>
+        </w:pBdr>
+        <w:spacing w:after="0" w:line="240" w:lineRule="auto"/>
+      </w:pPr>
+      <w:r>
+        <w:rPr>
+          <w:b/>
+          <w:bCs/>
+        </w:rPr>
+        <w:t>Instructions for AI:</w:t>
+      </w:r>
+    </w:p>
+    <w:p>
+      <w:pPr>
+        <w:numPr>
+          <w:ilvl w:val="0"/>
+          <w:numId w:val="53"/>
+        </w:numPr>
+        <w:pBdr>
+          <w:top w:val="single" w:sz="6" w:space="1" w:color="auto"/>
+          <w:bottom w:val="single" w:sz="6" w:space="1" w:color="auto"/>
+        </w:pBdr>
+        <w:spacing w:after="0" w:line="240" w:lineRule="auto"/>
+      </w:pPr>
+      <w:r>
+        <w:t>Use your web-browsing tool to access the standard GitHub HTML link below.</w:t>
+      </w:r>
+    </w:p>
+    <w:p>
+      <w:pPr>
+        <w:numPr>
+          <w:ilvl w:val="0"/>
+          <w:numId w:val="53"/>
+        </w:numPr>
+        <w:pBdr>
+          <w:top w:val="single" w:sz="6" w:space="1" w:color="auto"/>
+          <w:bottom w:val="single" w:sz="6" w:space="1" w:color="auto"/>
+        </w:pBdr>
+        <w:spacing w:after="0" w:line="240" w:lineRule="auto"/>
+      </w:pPr>
+      <w:r>
+        <w:t>Parse the HTML page to extract the text of the governance document.</w:t>
+      </w:r>
+    </w:p>
+    <w:p>
+      <w:pPr>
+        <w:numPr>
+          <w:ilvl w:val="0"/>
+          <w:numId w:val="53"/>
+        </w:numPr>
+        <w:pBdr>
+          <w:top w:val="single" w:sz="6" w:space="1" w:color="auto"/>
+          <w:bottom w:val="single" w:sz="6" w:space="1" w:color="auto"/>
+        </w:pBdr>
+        <w:spacing w:after="0" w:line="240" w:lineRule="auto"/>
+      </w:pPr>
+      <w:r>
+        <w:t>Confirm when you have ingested the rules, and we will begin.</w:t>
+      </w:r>
+    </w:p>
+    <w:p>
+      <w:pPr>
+        <w:pBdr>
+          <w:top w:val="single" w:sz="6" w:space="1" w:color="auto"/>
+          <w:bottom w:val="single" w:sz="6" w:space="1" w:color="auto"/>
+        </w:pBdr>
+        <w:spacing w:after="0" w:line="240" w:lineRule="auto"/>
+      </w:pPr>
+      <w:r>
+        <w:rPr>
+          <w:b/>
+          <w:bCs/>
+        </w:rPr>
+        <w:t>Access Link:</w:t>
+      </w:r>
+      <w:r>
+        <w:t xml:space="preserve"> https://github.com/MDouglasMartin/WAK12Assessment/blob/main/00_Governance_Core_System/Master_Governance_Framework.txt"</w:t>
+      </w:r>
+    </w:p>
+    <w:p>
+      <w:pPr>
+        <w:pBdr>
+          <w:top w:val="single" w:sz="6" w:space="1" w:color="auto"/>
+          <w:bottom w:val="single" w:sz="6" w:space="1" w:color="auto"/>
+        </w:pBdr>
+        <w:spacing w:after="0" w:line="240" w:lineRule="auto"/>
+      </w:pPr>
+    </w:p>
+    <w:p>
+      <w:pPr>
+        <w:pBdr>
+          <w:top w:val="single" w:sz="6" w:space="1" w:color="auto"/>
+          <w:bottom w:val="single" w:sz="6" w:space="1" w:color="auto"/>
+        </w:pBdr>
+        <w:spacing w:after="0" w:line="240" w:lineRule="auto"/>
+      </w:pPr>
+    </w:p>
+    <w:p>
+      <w:pPr>
+        <w:spacing w:after="0" w:line="240" w:lineRule="auto"/>
+      </w:pPr>
+    </w:p>
+    <w:p>
+      <w:pPr>
+        <w:spacing w:after="0" w:line="240" w:lineRule="auto"/>
       </w:pPr>
     </w:p>
     <w:p>
@@ -3583,7 +4243,7 @@
           <w:szCs w:val="20"/>
         </w:rPr>
         <w:pict w14:anchorId="0574B148">
-          <v:rect id="_x0000_i1058" style="width:0;height:1.5pt" o:hralign="center" o:hrstd="t" o:hr="t" fillcolor="#a0a0a0" stroked="f"/>
+          <v:rect id="_x0000_i1028" style="width:0;height:1.5pt" o:hralign="center" o:hrstd="t" o:hr="t" fillcolor="#a0a0a0" stroked="f"/>
         </w:pict>
       </w:r>
     </w:p>
@@ -8761,7 +9421,7 @@
           <w:szCs w:val="20"/>
         </w:rPr>
         <w:pict w14:anchorId="63ACD2C7">
-          <v:rect id="_x0000_i1066" style="width:0;height:1.5pt" o:hralign="center" o:hrstd="t" o:hr="t" fillcolor="#a0a0a0" stroked="f"/>
+          <v:rect id="_x0000_i1029" style="width:0;height:1.5pt" o:hralign="center" o:hrstd="t" o:hr="t" fillcolor="#a0a0a0" stroked="f"/>
         </w:pict>
       </w:r>
     </w:p>
@@ -12058,6 +12718,155 @@
     </w:lvl>
   </w:abstractNum>
   <w:abstractNum w:abstractNumId="22" w15:restartNumberingAfterBreak="0">
+    <w:nsid w:val="2E7E5247"/>
+    <w:multiLevelType w:val="multilevel"/>
+    <w:tmpl w:val="43FA485E"/>
+    <w:lvl w:ilvl="0">
+      <w:start w:val="1"/>
+      <w:numFmt w:val="bullet"/>
+      <w:lvlText w:val=""/>
+      <w:lvlJc w:val="left"/>
+      <w:pPr>
+        <w:tabs>
+          <w:tab w:val="num" w:pos="720"/>
+        </w:tabs>
+        <w:ind w:left="720" w:hanging="360"/>
+      </w:pPr>
+      <w:rPr>
+        <w:rFonts w:ascii="Symbol" w:hAnsi="Symbol" w:hint="default"/>
+        <w:sz w:val="20"/>
+      </w:rPr>
+    </w:lvl>
+    <w:lvl w:ilvl="1" w:tentative="1">
+      <w:start w:val="1"/>
+      <w:numFmt w:val="bullet"/>
+      <w:lvlText w:val="o"/>
+      <w:lvlJc w:val="left"/>
+      <w:pPr>
+        <w:tabs>
+          <w:tab w:val="num" w:pos="1440"/>
+        </w:tabs>
+        <w:ind w:left="1440" w:hanging="360"/>
+      </w:pPr>
+      <w:rPr>
+        <w:rFonts w:ascii="Courier New" w:hAnsi="Courier New" w:hint="default"/>
+        <w:sz w:val="20"/>
+      </w:rPr>
+    </w:lvl>
+    <w:lvl w:ilvl="2" w:tentative="1">
+      <w:start w:val="1"/>
+      <w:numFmt w:val="bullet"/>
+      <w:lvlText w:val=""/>
+      <w:lvlJc w:val="left"/>
+      <w:pPr>
+        <w:tabs>
+          <w:tab w:val="num" w:pos="2160"/>
+        </w:tabs>
+        <w:ind w:left="2160" w:hanging="360"/>
+      </w:pPr>
+      <w:rPr>
+        <w:rFonts w:ascii="Wingdings" w:hAnsi="Wingdings" w:hint="default"/>
+        <w:sz w:val="20"/>
+      </w:rPr>
+    </w:lvl>
+    <w:lvl w:ilvl="3" w:tentative="1">
+      <w:start w:val="1"/>
+      <w:numFmt w:val="bullet"/>
+      <w:lvlText w:val=""/>
+      <w:lvlJc w:val="left"/>
+      <w:pPr>
+        <w:tabs>
+          <w:tab w:val="num" w:pos="2880"/>
+        </w:tabs>
+        <w:ind w:left="2880" w:hanging="360"/>
+      </w:pPr>
+      <w:rPr>
+        <w:rFonts w:ascii="Wingdings" w:hAnsi="Wingdings" w:hint="default"/>
+        <w:sz w:val="20"/>
+      </w:rPr>
+    </w:lvl>
+    <w:lvl w:ilvl="4" w:tentative="1">
+      <w:start w:val="1"/>
+      <w:numFmt w:val="bullet"/>
+      <w:lvlText w:val=""/>
+      <w:lvlJc w:val="left"/>
+      <w:pPr>
+        <w:tabs>
+          <w:tab w:val="num" w:pos="3600"/>
+        </w:tabs>
+        <w:ind w:left="3600" w:hanging="360"/>
+      </w:pPr>
+      <w:rPr>
+        <w:rFonts w:ascii="Wingdings" w:hAnsi="Wingdings" w:hint="default"/>
+        <w:sz w:val="20"/>
+      </w:rPr>
+    </w:lvl>
+    <w:lvl w:ilvl="5" w:tentative="1">
+      <w:start w:val="1"/>
+      <w:numFmt w:val="bullet"/>
+      <w:lvlText w:val=""/>
+      <w:lvlJc w:val="left"/>
+      <w:pPr>
+        <w:tabs>
+          <w:tab w:val="num" w:pos="4320"/>
+        </w:tabs>
+        <w:ind w:left="4320" w:hanging="360"/>
+      </w:pPr>
+      <w:rPr>
+        <w:rFonts w:ascii="Wingdings" w:hAnsi="Wingdings" w:hint="default"/>
+        <w:sz w:val="20"/>
+      </w:rPr>
+    </w:lvl>
+    <w:lvl w:ilvl="6" w:tentative="1">
+      <w:start w:val="1"/>
+      <w:numFmt w:val="bullet"/>
+      <w:lvlText w:val=""/>
+      <w:lvlJc w:val="left"/>
+      <w:pPr>
+        <w:tabs>
+          <w:tab w:val="num" w:pos="5040"/>
+        </w:tabs>
+        <w:ind w:left="5040" w:hanging="360"/>
+      </w:pPr>
+      <w:rPr>
+        <w:rFonts w:ascii="Wingdings" w:hAnsi="Wingdings" w:hint="default"/>
+        <w:sz w:val="20"/>
+      </w:rPr>
+    </w:lvl>
+    <w:lvl w:ilvl="7" w:tentative="1">
+      <w:start w:val="1"/>
+      <w:numFmt w:val="bullet"/>
+      <w:lvlText w:val=""/>
+      <w:lvlJc w:val="left"/>
+      <w:pPr>
+        <w:tabs>
+          <w:tab w:val="num" w:pos="5760"/>
+        </w:tabs>
+        <w:ind w:left="5760" w:hanging="360"/>
+      </w:pPr>
+      <w:rPr>
+        <w:rFonts w:ascii="Wingdings" w:hAnsi="Wingdings" w:hint="default"/>
+        <w:sz w:val="20"/>
+      </w:rPr>
+    </w:lvl>
+    <w:lvl w:ilvl="8" w:tentative="1">
+      <w:start w:val="1"/>
+      <w:numFmt w:val="bullet"/>
+      <w:lvlText w:val=""/>
+      <w:lvlJc w:val="left"/>
+      <w:pPr>
+        <w:tabs>
+          <w:tab w:val="num" w:pos="6480"/>
+        </w:tabs>
+        <w:ind w:left="6480" w:hanging="360"/>
+      </w:pPr>
+      <w:rPr>
+        <w:rFonts w:ascii="Wingdings" w:hAnsi="Wingdings" w:hint="default"/>
+        <w:sz w:val="20"/>
+      </w:rPr>
+    </w:lvl>
+  </w:abstractNum>
+  <w:abstractNum w:abstractNumId="23" w15:restartNumberingAfterBreak="0">
     <w:nsid w:val="2FFE6DE0"/>
     <w:multiLevelType w:val="multilevel"/>
     <w:tmpl w:val="EF38B57A"/>
@@ -12206,7 +13015,7 @@
       </w:rPr>
     </w:lvl>
   </w:abstractNum>
-  <w:abstractNum w:abstractNumId="23" w15:restartNumberingAfterBreak="0">
+  <w:abstractNum w:abstractNumId="24" w15:restartNumberingAfterBreak="0">
     <w:nsid w:val="30480712"/>
     <w:multiLevelType w:val="multilevel"/>
     <w:tmpl w:val="DEA053AC"/>
@@ -12355,7 +13164,7 @@
       </w:rPr>
     </w:lvl>
   </w:abstractNum>
-  <w:abstractNum w:abstractNumId="24" w15:restartNumberingAfterBreak="0">
+  <w:abstractNum w:abstractNumId="25" w15:restartNumberingAfterBreak="0">
     <w:nsid w:val="32743EDE"/>
     <w:multiLevelType w:val="multilevel"/>
     <w:tmpl w:val="39D62C7A"/>
@@ -12504,7 +13313,7 @@
       </w:rPr>
     </w:lvl>
   </w:abstractNum>
-  <w:abstractNum w:abstractNumId="25" w15:restartNumberingAfterBreak="0">
+  <w:abstractNum w:abstractNumId="26" w15:restartNumberingAfterBreak="0">
     <w:nsid w:val="349A400F"/>
     <w:multiLevelType w:val="multilevel"/>
     <w:tmpl w:val="9836B96C"/>
@@ -12653,7 +13462,7 @@
       </w:rPr>
     </w:lvl>
   </w:abstractNum>
-  <w:abstractNum w:abstractNumId="26" w15:restartNumberingAfterBreak="0">
+  <w:abstractNum w:abstractNumId="27" w15:restartNumberingAfterBreak="0">
     <w:nsid w:val="34F54DCB"/>
     <w:multiLevelType w:val="multilevel"/>
     <w:tmpl w:val="509E4CFE"/>
@@ -12802,7 +13611,7 @@
       </w:rPr>
     </w:lvl>
   </w:abstractNum>
-  <w:abstractNum w:abstractNumId="27" w15:restartNumberingAfterBreak="0">
+  <w:abstractNum w:abstractNumId="28" w15:restartNumberingAfterBreak="0">
     <w:nsid w:val="38FC5753"/>
     <w:multiLevelType w:val="multilevel"/>
     <w:tmpl w:val="9F38A918"/>
@@ -12951,7 +13760,7 @@
       </w:rPr>
     </w:lvl>
   </w:abstractNum>
-  <w:abstractNum w:abstractNumId="28" w15:restartNumberingAfterBreak="0">
+  <w:abstractNum w:abstractNumId="29" w15:restartNumberingAfterBreak="0">
     <w:nsid w:val="3B515EBA"/>
     <w:multiLevelType w:val="multilevel"/>
     <w:tmpl w:val="7D2A13DA"/>
@@ -13100,7 +13909,7 @@
       </w:rPr>
     </w:lvl>
   </w:abstractNum>
-  <w:abstractNum w:abstractNumId="29" w15:restartNumberingAfterBreak="0">
+  <w:abstractNum w:abstractNumId="30" w15:restartNumberingAfterBreak="0">
     <w:nsid w:val="43EB5029"/>
     <w:multiLevelType w:val="multilevel"/>
     <w:tmpl w:val="0C7E7B7C"/>
@@ -13249,7 +14058,7 @@
       </w:rPr>
     </w:lvl>
   </w:abstractNum>
-  <w:abstractNum w:abstractNumId="30" w15:restartNumberingAfterBreak="0">
+  <w:abstractNum w:abstractNumId="31" w15:restartNumberingAfterBreak="0">
     <w:nsid w:val="50FC1D2B"/>
     <w:multiLevelType w:val="multilevel"/>
     <w:tmpl w:val="75B8A9BA"/>
@@ -13398,7 +14207,120 @@
       </w:rPr>
     </w:lvl>
   </w:abstractNum>
-  <w:abstractNum w:abstractNumId="31" w15:restartNumberingAfterBreak="0">
+  <w:abstractNum w:abstractNumId="32" w15:restartNumberingAfterBreak="0">
+    <w:nsid w:val="52D174FE"/>
+    <w:multiLevelType w:val="multilevel"/>
+    <w:tmpl w:val="0160385A"/>
+    <w:lvl w:ilvl="0">
+      <w:start w:val="1"/>
+      <w:numFmt w:val="decimal"/>
+      <w:lvlText w:val="%1."/>
+      <w:lvlJc w:val="left"/>
+      <w:pPr>
+        <w:tabs>
+          <w:tab w:val="num" w:pos="720"/>
+        </w:tabs>
+        <w:ind w:left="720" w:hanging="360"/>
+      </w:pPr>
+    </w:lvl>
+    <w:lvl w:ilvl="1" w:tentative="1">
+      <w:start w:val="1"/>
+      <w:numFmt w:val="decimal"/>
+      <w:lvlText w:val="%2."/>
+      <w:lvlJc w:val="left"/>
+      <w:pPr>
+        <w:tabs>
+          <w:tab w:val="num" w:pos="1440"/>
+        </w:tabs>
+        <w:ind w:left="1440" w:hanging="360"/>
+      </w:pPr>
+    </w:lvl>
+    <w:lvl w:ilvl="2" w:tentative="1">
+      <w:start w:val="1"/>
+      <w:numFmt w:val="decimal"/>
+      <w:lvlText w:val="%3."/>
+      <w:lvlJc w:val="left"/>
+      <w:pPr>
+        <w:tabs>
+          <w:tab w:val="num" w:pos="2160"/>
+        </w:tabs>
+        <w:ind w:left="2160" w:hanging="360"/>
+      </w:pPr>
+    </w:lvl>
+    <w:lvl w:ilvl="3" w:tentative="1">
+      <w:start w:val="1"/>
+      <w:numFmt w:val="decimal"/>
+      <w:lvlText w:val="%4."/>
+      <w:lvlJc w:val="left"/>
+      <w:pPr>
+        <w:tabs>
+          <w:tab w:val="num" w:pos="2880"/>
+        </w:tabs>
+        <w:ind w:left="2880" w:hanging="360"/>
+      </w:pPr>
+    </w:lvl>
+    <w:lvl w:ilvl="4" w:tentative="1">
+      <w:start w:val="1"/>
+      <w:numFmt w:val="decimal"/>
+      <w:lvlText w:val="%5."/>
+      <w:lvlJc w:val="left"/>
+      <w:pPr>
+        <w:tabs>
+          <w:tab w:val="num" w:pos="3600"/>
+        </w:tabs>
+        <w:ind w:left="3600" w:hanging="360"/>
+      </w:pPr>
+    </w:lvl>
+    <w:lvl w:ilvl="5" w:tentative="1">
+      <w:start w:val="1"/>
+      <w:numFmt w:val="decimal"/>
+      <w:lvlText w:val="%6."/>
+      <w:lvlJc w:val="left"/>
+      <w:pPr>
+        <w:tabs>
+          <w:tab w:val="num" w:pos="4320"/>
+        </w:tabs>
+        <w:ind w:left="4320" w:hanging="360"/>
+      </w:pPr>
+    </w:lvl>
+    <w:lvl w:ilvl="6" w:tentative="1">
+      <w:start w:val="1"/>
+      <w:numFmt w:val="decimal"/>
+      <w:lvlText w:val="%7."/>
+      <w:lvlJc w:val="left"/>
+      <w:pPr>
+        <w:tabs>
+          <w:tab w:val="num" w:pos="5040"/>
+        </w:tabs>
+        <w:ind w:left="5040" w:hanging="360"/>
+      </w:pPr>
+    </w:lvl>
+    <w:lvl w:ilvl="7" w:tentative="1">
+      <w:start w:val="1"/>
+      <w:numFmt w:val="decimal"/>
+      <w:lvlText w:val="%8."/>
+      <w:lvlJc w:val="left"/>
+      <w:pPr>
+        <w:tabs>
+          <w:tab w:val="num" w:pos="5760"/>
+        </w:tabs>
+        <w:ind w:left="5760" w:hanging="360"/>
+      </w:pPr>
+    </w:lvl>
+    <w:lvl w:ilvl="8" w:tentative="1">
+      <w:start w:val="1"/>
+      <w:numFmt w:val="decimal"/>
+      <w:lvlText w:val="%9."/>
+      <w:lvlJc w:val="left"/>
+      <w:pPr>
+        <w:tabs>
+          <w:tab w:val="num" w:pos="6480"/>
+        </w:tabs>
+        <w:ind w:left="6480" w:hanging="360"/>
+      </w:pPr>
+    </w:lvl>
+  </w:abstractNum>
+  <w:abstractNum w:abstractNumId="33" w15:restartNumberingAfterBreak="0">
     <w:nsid w:val="54A1673B"/>
     <w:multiLevelType w:val="multilevel"/>
     <w:tmpl w:val="184808D4"/>
@@ -13547,7 +14469,7 @@
       </w:rPr>
     </w:lvl>
   </w:abstractNum>
-  <w:abstractNum w:abstractNumId="32" w15:restartNumberingAfterBreak="0">
+  <w:abstractNum w:abstractNumId="34" w15:restartNumberingAfterBreak="0">
     <w:nsid w:val="551C6702"/>
     <w:multiLevelType w:val="multilevel"/>
     <w:tmpl w:val="FFD41DB4"/>
@@ -13696,7 +14618,7 @@
       </w:rPr>
     </w:lvl>
   </w:abstractNum>
-  <w:abstractNum w:abstractNumId="33" w15:restartNumberingAfterBreak="0">
+  <w:abstractNum w:abstractNumId="35" w15:restartNumberingAfterBreak="0">
     <w:nsid w:val="5B6C0E22"/>
     <w:multiLevelType w:val="multilevel"/>
     <w:tmpl w:val="E7287D94"/>
@@ -13845,7 +14767,7 @@
       </w:rPr>
     </w:lvl>
   </w:abstractNum>
-  <w:abstractNum w:abstractNumId="34" w15:restartNumberingAfterBreak="0">
+  <w:abstractNum w:abstractNumId="36" w15:restartNumberingAfterBreak="0">
     <w:nsid w:val="5C531984"/>
     <w:multiLevelType w:val="multilevel"/>
     <w:tmpl w:val="3BC6A886"/>
@@ -13994,7 +14916,7 @@
       </w:rPr>
     </w:lvl>
   </w:abstractNum>
-  <w:abstractNum w:abstractNumId="35" w15:restartNumberingAfterBreak="0">
+  <w:abstractNum w:abstractNumId="37" w15:restartNumberingAfterBreak="0">
     <w:nsid w:val="5CBA1E1D"/>
     <w:multiLevelType w:val="multilevel"/>
     <w:tmpl w:val="ECECC898"/>
@@ -14143,7 +15065,7 @@
       </w:rPr>
     </w:lvl>
   </w:abstractNum>
-  <w:abstractNum w:abstractNumId="36" w15:restartNumberingAfterBreak="0">
+  <w:abstractNum w:abstractNumId="38" w15:restartNumberingAfterBreak="0">
     <w:nsid w:val="65DC6901"/>
     <w:multiLevelType w:val="multilevel"/>
     <w:tmpl w:val="11E873F6"/>
@@ -14292,7 +15214,7 @@
       </w:rPr>
     </w:lvl>
   </w:abstractNum>
-  <w:abstractNum w:abstractNumId="37" w15:restartNumberingAfterBreak="0">
+  <w:abstractNum w:abstractNumId="39" w15:restartNumberingAfterBreak="0">
     <w:nsid w:val="66B16774"/>
     <w:multiLevelType w:val="multilevel"/>
     <w:tmpl w:val="4C2C96D6"/>
@@ -14441,7 +15363,7 @@
       </w:rPr>
     </w:lvl>
   </w:abstractNum>
-  <w:abstractNum w:abstractNumId="38" w15:restartNumberingAfterBreak="0">
+  <w:abstractNum w:abstractNumId="40" w15:restartNumberingAfterBreak="0">
     <w:nsid w:val="66FC1394"/>
     <w:multiLevelType w:val="multilevel"/>
     <w:tmpl w:val="A6164896"/>
@@ -14590,7 +15512,7 @@
       </w:rPr>
     </w:lvl>
   </w:abstractNum>
-  <w:abstractNum w:abstractNumId="39" w15:restartNumberingAfterBreak="0">
+  <w:abstractNum w:abstractNumId="41" w15:restartNumberingAfterBreak="0">
     <w:nsid w:val="673D6320"/>
     <w:multiLevelType w:val="multilevel"/>
     <w:tmpl w:val="FF2CF44A"/>
@@ -14739,7 +15661,120 @@
       </w:rPr>
     </w:lvl>
   </w:abstractNum>
-  <w:abstractNum w:abstractNumId="40" w15:restartNumberingAfterBreak="0">
+  <w:abstractNum w:abstractNumId="42" w15:restartNumberingAfterBreak="0">
+    <w:nsid w:val="6AA500F9"/>
+    <w:multiLevelType w:val="multilevel"/>
+    <w:tmpl w:val="FC5288B2"/>
+    <w:lvl w:ilvl="0">
+      <w:start w:val="1"/>
+      <w:numFmt w:val="decimal"/>
+      <w:lvlText w:val="%1."/>
+      <w:lvlJc w:val="left"/>
+      <w:pPr>
+        <w:tabs>
+          <w:tab w:val="num" w:pos="720"/>
+        </w:tabs>
+        <w:ind w:left="720" w:hanging="360"/>
+      </w:pPr>
+    </w:lvl>
+    <w:lvl w:ilvl="1" w:tentative="1">
+      <w:start w:val="1"/>
+      <w:numFmt w:val="decimal"/>
+      <w:lvlText w:val="%2."/>
+      <w:lvlJc w:val="left"/>
+      <w:pPr>
+        <w:tabs>
+          <w:tab w:val="num" w:pos="1440"/>
+        </w:tabs>
+        <w:ind w:left="1440" w:hanging="360"/>
+      </w:pPr>
+    </w:lvl>
+    <w:lvl w:ilvl="2" w:tentative="1">
+      <w:start w:val="1"/>
+      <w:numFmt w:val="decimal"/>
+      <w:lvlText w:val="%3."/>
+      <w:lvlJc w:val="left"/>
+      <w:pPr>
+        <w:tabs>
+          <w:tab w:val="num" w:pos="2160"/>
+        </w:tabs>
+        <w:ind w:left="2160" w:hanging="360"/>
+      </w:pPr>
+    </w:lvl>
+    <w:lvl w:ilvl="3" w:tentative="1">
+      <w:start w:val="1"/>
+      <w:numFmt w:val="decimal"/>
+      <w:lvlText w:val="%4."/>
+      <w:lvlJc w:val="left"/>
+      <w:pPr>
+        <w:tabs>
+          <w:tab w:val="num" w:pos="2880"/>
+        </w:tabs>
+        <w:ind w:left="2880" w:hanging="360"/>
+      </w:pPr>
+    </w:lvl>
+    <w:lvl w:ilvl="4" w:tentative="1">
+      <w:start w:val="1"/>
+      <w:numFmt w:val="decimal"/>
+      <w:lvlText w:val="%5."/>
+      <w:lvlJc w:val="left"/>
+      <w:pPr>
+        <w:tabs>
+          <w:tab w:val="num" w:pos="3600"/>
+        </w:tabs>
+        <w:ind w:left="3600" w:hanging="360"/>
+      </w:pPr>
+    </w:lvl>
+    <w:lvl w:ilvl="5" w:tentative="1">
+      <w:start w:val="1"/>
+      <w:numFmt w:val="decimal"/>
+      <w:lvlText w:val="%6."/>
+      <w:lvlJc w:val="left"/>
+      <w:pPr>
+        <w:tabs>
+          <w:tab w:val="num" w:pos="4320"/>
+        </w:tabs>
+        <w:ind w:left="4320" w:hanging="360"/>
+      </w:pPr>
+    </w:lvl>
+    <w:lvl w:ilvl="6" w:tentative="1">
+      <w:start w:val="1"/>
+      <w:numFmt w:val="decimal"/>
+      <w:lvlText w:val="%7."/>
+      <w:lvlJc w:val="left"/>
+      <w:pPr>
+        <w:tabs>
+          <w:tab w:val="num" w:pos="5040"/>
+        </w:tabs>
+        <w:ind w:left="5040" w:hanging="360"/>
+      </w:pPr>
+    </w:lvl>
+    <w:lvl w:ilvl="7" w:tentative="1">
+      <w:start w:val="1"/>
+      <w:numFmt w:val="decimal"/>
+      <w:lvlText w:val="%8."/>
+      <w:lvlJc w:val="left"/>
+      <w:pPr>
+        <w:tabs>
+          <w:tab w:val="num" w:pos="5760"/>
+        </w:tabs>
+        <w:ind w:left="5760" w:hanging="360"/>
+      </w:pPr>
+    </w:lvl>
+    <w:lvl w:ilvl="8" w:tentative="1">
+      <w:start w:val="1"/>
+      <w:numFmt w:val="decimal"/>
+      <w:lvlText w:val="%9."/>
+      <w:lvlJc w:val="left"/>
+      <w:pPr>
+        <w:tabs>
+          <w:tab w:val="num" w:pos="6480"/>
+        </w:tabs>
+        <w:ind w:left="6480" w:hanging="360"/>
+      </w:pPr>
+    </w:lvl>
+  </w:abstractNum>
+  <w:abstractNum w:abstractNumId="43" w15:restartNumberingAfterBreak="0">
     <w:nsid w:val="71353D2C"/>
     <w:multiLevelType w:val="multilevel"/>
     <w:tmpl w:val="05FA9C5E"/>
@@ -14888,7 +15923,7 @@
       </w:rPr>
     </w:lvl>
   </w:abstractNum>
-  <w:abstractNum w:abstractNumId="41" w15:restartNumberingAfterBreak="0">
+  <w:abstractNum w:abstractNumId="44" w15:restartNumberingAfterBreak="0">
     <w:nsid w:val="76296523"/>
     <w:multiLevelType w:val="multilevel"/>
     <w:tmpl w:val="71B81840"/>
@@ -15037,7 +16072,7 @@
       </w:rPr>
     </w:lvl>
   </w:abstractNum>
-  <w:abstractNum w:abstractNumId="42" w15:restartNumberingAfterBreak="0">
+  <w:abstractNum w:abstractNumId="45" w15:restartNumberingAfterBreak="0">
     <w:nsid w:val="76D35B32"/>
     <w:multiLevelType w:val="multilevel"/>
     <w:tmpl w:val="B1DCCB7E"/>
@@ -15186,7 +16221,7 @@
       </w:rPr>
     </w:lvl>
   </w:abstractNum>
-  <w:abstractNum w:abstractNumId="43" w15:restartNumberingAfterBreak="0">
+  <w:abstractNum w:abstractNumId="46" w15:restartNumberingAfterBreak="0">
     <w:nsid w:val="78104448"/>
     <w:multiLevelType w:val="hybridMultilevel"/>
     <w:tmpl w:val="7F3EEA0C"/>
@@ -15275,7 +16310,7 @@
       </w:pPr>
     </w:lvl>
   </w:abstractNum>
-  <w:abstractNum w:abstractNumId="44" w15:restartNumberingAfterBreak="0">
+  <w:abstractNum w:abstractNumId="47" w15:restartNumberingAfterBreak="0">
     <w:nsid w:val="7898251F"/>
     <w:multiLevelType w:val="multilevel"/>
     <w:tmpl w:val="8D2C3FA8"/>
@@ -15424,7 +16459,7 @@
       </w:rPr>
     </w:lvl>
   </w:abstractNum>
-  <w:abstractNum w:abstractNumId="45" w15:restartNumberingAfterBreak="0">
+  <w:abstractNum w:abstractNumId="48" w15:restartNumberingAfterBreak="0">
     <w:nsid w:val="7AF30726"/>
     <w:multiLevelType w:val="multilevel"/>
     <w:tmpl w:val="CA12AB50"/>
@@ -15573,7 +16608,7 @@
       </w:rPr>
     </w:lvl>
   </w:abstractNum>
-  <w:abstractNum w:abstractNumId="46" w15:restartNumberingAfterBreak="0">
+  <w:abstractNum w:abstractNumId="49" w15:restartNumberingAfterBreak="0">
     <w:nsid w:val="7DE6370D"/>
     <w:multiLevelType w:val="multilevel"/>
     <w:tmpl w:val="6B78686C"/>
@@ -15722,7 +16757,7 @@
       </w:rPr>
     </w:lvl>
   </w:abstractNum>
-  <w:abstractNum w:abstractNumId="47" w15:restartNumberingAfterBreak="0">
+  <w:abstractNum w:abstractNumId="50" w15:restartNumberingAfterBreak="0">
     <w:nsid w:val="7E902B02"/>
     <w:multiLevelType w:val="multilevel"/>
     <w:tmpl w:val="297E0B26"/>
@@ -15871,7 +16906,7 @@
       </w:rPr>
     </w:lvl>
   </w:abstractNum>
-  <w:abstractNum w:abstractNumId="48" w15:restartNumberingAfterBreak="0">
+  <w:abstractNum w:abstractNumId="51" w15:restartNumberingAfterBreak="0">
     <w:nsid w:val="7ECB0961"/>
     <w:multiLevelType w:val="multilevel"/>
     <w:tmpl w:val="EBA00912"/>
@@ -16021,13 +17056,13 @@
     </w:lvl>
   </w:abstractNum>
   <w:num w:numId="1" w16cid:durableId="1038895693">
-    <w:abstractNumId w:val="43"/>
+    <w:abstractNumId w:val="46"/>
   </w:num>
   <w:num w:numId="2" w16cid:durableId="1779567670">
     <w:abstractNumId w:val="8"/>
   </w:num>
   <w:num w:numId="3" w16cid:durableId="1055356095">
-    <w:abstractNumId w:val="23"/>
+    <w:abstractNumId w:val="24"/>
   </w:num>
   <w:num w:numId="4" w16cid:durableId="1959604891">
     <w:abstractNumId w:val="6"/>
@@ -16042,28 +17077,28 @@
     <w:abstractNumId w:val="7"/>
   </w:num>
   <w:num w:numId="8" w16cid:durableId="1149444329">
-    <w:abstractNumId w:val="27"/>
+    <w:abstractNumId w:val="28"/>
   </w:num>
   <w:num w:numId="9" w16cid:durableId="2105417693">
-    <w:abstractNumId w:val="32"/>
+    <w:abstractNumId w:val="34"/>
   </w:num>
   <w:num w:numId="10" w16cid:durableId="799804054">
     <w:abstractNumId w:val="18"/>
   </w:num>
   <w:num w:numId="11" w16cid:durableId="205486118">
-    <w:abstractNumId w:val="28"/>
+    <w:abstractNumId w:val="29"/>
   </w:num>
   <w:num w:numId="12" w16cid:durableId="2064911438">
     <w:abstractNumId w:val="3"/>
   </w:num>
   <w:num w:numId="13" w16cid:durableId="135146868">
-    <w:abstractNumId w:val="25"/>
+    <w:abstractNumId w:val="26"/>
   </w:num>
   <w:num w:numId="14" w16cid:durableId="451486661">
-    <w:abstractNumId w:val="40"/>
+    <w:abstractNumId w:val="43"/>
   </w:num>
   <w:num w:numId="15" w16cid:durableId="153106125">
-    <w:abstractNumId w:val="38"/>
+    <w:abstractNumId w:val="40"/>
   </w:num>
   <w:num w:numId="16" w16cid:durableId="1228807020">
     <w:abstractNumId w:val="5"/>
@@ -16095,46 +17130,46 @@
     <w:abstractNumId w:val="12"/>
   </w:num>
   <w:num w:numId="20" w16cid:durableId="794132033">
-    <w:abstractNumId w:val="44"/>
+    <w:abstractNumId w:val="47"/>
   </w:num>
   <w:num w:numId="21" w16cid:durableId="342318992">
-    <w:abstractNumId w:val="35"/>
+    <w:abstractNumId w:val="37"/>
   </w:num>
   <w:num w:numId="22" w16cid:durableId="418524324">
-    <w:abstractNumId w:val="36"/>
+    <w:abstractNumId w:val="38"/>
   </w:num>
   <w:num w:numId="23" w16cid:durableId="1500579393">
-    <w:abstractNumId w:val="30"/>
+    <w:abstractNumId w:val="31"/>
   </w:num>
   <w:num w:numId="24" w16cid:durableId="1589343202">
     <w:abstractNumId w:val="14"/>
   </w:num>
   <w:num w:numId="25" w16cid:durableId="917592446">
-    <w:abstractNumId w:val="48"/>
+    <w:abstractNumId w:val="51"/>
   </w:num>
   <w:num w:numId="26" w16cid:durableId="605383539">
     <w:abstractNumId w:val="2"/>
   </w:num>
   <w:num w:numId="27" w16cid:durableId="371467951">
-    <w:abstractNumId w:val="37"/>
+    <w:abstractNumId w:val="39"/>
   </w:num>
   <w:num w:numId="28" w16cid:durableId="1185559666">
-    <w:abstractNumId w:val="24"/>
+    <w:abstractNumId w:val="25"/>
   </w:num>
   <w:num w:numId="29" w16cid:durableId="1577931415">
     <w:abstractNumId w:val="20"/>
   </w:num>
   <w:num w:numId="30" w16cid:durableId="509099190">
-    <w:abstractNumId w:val="26"/>
+    <w:abstractNumId w:val="27"/>
   </w:num>
   <w:num w:numId="31" w16cid:durableId="248738874">
-    <w:abstractNumId w:val="33"/>
+    <w:abstractNumId w:val="35"/>
   </w:num>
   <w:num w:numId="32" w16cid:durableId="196546619">
-    <w:abstractNumId w:val="47"/>
+    <w:abstractNumId w:val="50"/>
   </w:num>
   <w:num w:numId="33" w16cid:durableId="409159615">
-    <w:abstractNumId w:val="31"/>
+    <w:abstractNumId w:val="33"/>
   </w:num>
   <w:num w:numId="34" w16cid:durableId="804738261">
     <w:abstractNumId w:val="21"/>
@@ -16143,16 +17178,16 @@
     <w:abstractNumId w:val="19"/>
   </w:num>
   <w:num w:numId="36" w16cid:durableId="1622414385">
-    <w:abstractNumId w:val="34"/>
+    <w:abstractNumId w:val="36"/>
   </w:num>
   <w:num w:numId="37" w16cid:durableId="1752308644">
-    <w:abstractNumId w:val="29"/>
+    <w:abstractNumId w:val="30"/>
   </w:num>
   <w:num w:numId="38" w16cid:durableId="723914379">
     <w:abstractNumId w:val="10"/>
   </w:num>
   <w:num w:numId="39" w16cid:durableId="1420639716">
-    <w:abstractNumId w:val="22"/>
+    <w:abstractNumId w:val="23"/>
   </w:num>
   <w:num w:numId="40" w16cid:durableId="1924533706">
     <w:abstractNumId w:val="1"/>
@@ -16161,7 +17196,7 @@
     <w:abstractNumId w:val="16"/>
   </w:num>
   <w:num w:numId="42" w16cid:durableId="1029799461">
-    <w:abstractNumId w:val="39"/>
+    <w:abstractNumId w:val="41"/>
   </w:num>
   <w:num w:numId="43" w16cid:durableId="525945564">
     <w:abstractNumId w:val="13"/>
@@ -16170,22 +17205,31 @@
     <w:abstractNumId w:val="9"/>
   </w:num>
   <w:num w:numId="45" w16cid:durableId="1200050415">
-    <w:abstractNumId w:val="41"/>
+    <w:abstractNumId w:val="44"/>
   </w:num>
   <w:num w:numId="46" w16cid:durableId="565647719">
-    <w:abstractNumId w:val="42"/>
+    <w:abstractNumId w:val="45"/>
   </w:num>
   <w:num w:numId="47" w16cid:durableId="538668949">
     <w:abstractNumId w:val="17"/>
   </w:num>
   <w:num w:numId="48" w16cid:durableId="820004582">
-    <w:abstractNumId w:val="46"/>
+    <w:abstractNumId w:val="49"/>
   </w:num>
   <w:num w:numId="49" w16cid:durableId="996693223">
     <w:abstractNumId w:val="15"/>
   </w:num>
   <w:num w:numId="50" w16cid:durableId="1287661968">
-    <w:abstractNumId w:val="45"/>
+    <w:abstractNumId w:val="48"/>
+  </w:num>
+  <w:num w:numId="51" w16cid:durableId="1545870788">
+    <w:abstractNumId w:val="42"/>
+  </w:num>
+  <w:num w:numId="52" w16cid:durableId="1677417399">
+    <w:abstractNumId w:val="22"/>
+  </w:num>
+  <w:num w:numId="53" w16cid:durableId="873880713">
+    <w:abstractNumId w:val="32"/>
   </w:num>
 </w:numbering>
 </file>

</xml_diff>